<commit_message>
Readable Ceará map: shoreline clip, 65% cells, municipality labels, locator inset, boundary hover names; corrected figures in paper, memo and slide
</commit_message>
<xml_diff>
--- a/docs/Brazil_SCN_Framework_v2.docx
+++ b/docs/Brazil_SCN_Framework_v2.docx
@@ -99,7 +99,7 @@
           <w:b/>
           <w:bCs/>
         </w:rPr>
-        <w:t xml:space="preserve">Brazil’s newly enacted Law No. 15,504 establishes the Special Taxation Regime for Data Center Services (ReData) ties federal tax relief to clean power, water efficiency, reserved domestic capacity, and regional decentralization, and it is framed to absorb curtailed renewable generation in the North and Northeast. The international hyperscalers and domestic colocation operators that would use the regime need, in turn, gigawatt-scale interconnection, fiber, and land free of legal conflict. This paper presents a reproducible, constraint-first screening model that joins public grid, curtailment, land-use, surface-water, facility, and policy-corpus data, demonstrated on a case study located on the Ceará coast. Curtailment is concentrated in the Northeast (87% of 63.5 TWh) while 71% of facilities sit in São Paulo and Rio de Janeiro; the binding constraint is transmission, not generation; and within the box, 819 of 2,808 cells survive the hard constraints, 448 form the Pareto frontier, and 25 are recommended, of which 10 require human review, eight because they lie within 2.5 km of a conservation unit or of a Tupinambá indigenous land. Constraint-first screening makes the socioenvironmental tension of ReData-era siting measurable from public data before licensing begins, on a coast where wind-energy expansion has already produced documented conflicts with traditional communities.</w:t>
+        <w:t xml:space="preserve">Brazil’s newly enacted Law No. 15,504 establishes the Special Taxation Regime for Data Center Services (ReData), which ties federal tax relief to clean power, water efficiency, reserved domestic capacity, and regional decentralization, and is framed to absorb curtailed renewable generation in the Northeast. The international hyperscalers and domestic colocation operators that would use the regime need, in turn, gigawatt-scale interconnection, fiber, and land free of legal conflict. This paper presents a reproducible, constraint-first screening model that joins public grid, curtailment, land-use, surface-water, facility, and policy-corpus data, demonstrated on a case study located on the Ceará coast. Curtailment is concentrated in the Northeast (87% of 63.5 TWh) while 71% of facilities sit in São Paulo and Rio de Janeiro; the binding constraint is transmission, not generation; and within the box, 966 of 2,808 cells survive the hard constraints, 505 form the Pareto frontier, and 25 are recommended, of which 12 require human review, eight because they lie within 2.5 km of a conservation unit or of the Tapeba indigenous land. Constraint-first screening makes the socioenvironmental tension of ReData-era siting measurable from public data before licensing begins, on a coast where wind-energy expansion has already produced documented conflicts with traditional communities.</w:t>
       </w:r>
     </w:p>
     <w:p>
@@ -2599,7 +2599,7 @@
           <w:sz w:val="21"/>
           <w:szCs w:val="21"/>
         </w:rPr>
-        <w:t xml:space="preserve">  The ONS topology carries 1,705 buses, 1,838 branches, and 198,138 MW [20]. Placing the inventory’s 3,552 proposed plants (463,005 MW) on that topology with transmission fixed raises overloaded branches from 1 to 236 and branches above 75% loading from 9 to 335. Ceará is the extreme: 6,294 MW installed against 91,886 MW proposed, the largest build-out of any state, with the lowest transmission headroom in the country (0.07 on a 0–1 scale). A data center meant to absorb curtailed energy must sit where a substation with headroom is within each, and the interconnection queue, not land, will set its timing. The overlay is a DC power-flow proxy, not a dispatch forecast.</w:t>
+        <w:t xml:space="preserve">  The ONS topology carries 1,705 buses, 1,838 branches, and 198,138 MW [20]. Placing the inventory’s 3,552 proposed plants (463,005 MW) on that topology with transmission fixed raises overloaded branches from 1 to 236 and branches above 75% loading from 9 to 335. Ceará is the extreme: 6,294 MW installed against 91,886 MW proposed, the largest build-out of any state, with the lowest transmission headroom in the country (0.07 on a 0–1 scale). A data center meant to absorb curtailed energy must sit where a substation with headroom is within reach, and the interconnection queue, not land, will set its timing. The overlay is a DC power-flow proxy, not a dispatch forecast.</w:t>
       </w:r>
     </w:p>
     <w:p>
@@ -2648,7 +2648,7 @@
           <w:sz w:val="21"/>
           <w:szCs w:val="21"/>
         </w:rPr>
-        <w:t xml:space="preserve">  The Ceará box is crowded with legal boundaries. Of its 2,808 cells, 1,353 lie offshore or outside the state, leaving 1,455 on land; 232 of those overlap conservation units, 124 overlap indigenous lands (Tapeba, declared, and Taba dos Anacé, in demarcation), and 552 lie within 2.5 km of one of those boundaries. Phase 3 hard-excludes 1,737 cells and 819 survive every constraint. The review flag then tracks the frontier upward: 246 of the 819 feasible cells carry it (30%), 73 of the 448 frontier cells, and 10 of the 25 recommended sites. Eight of the ten lie within the 2.5 km buffer, seven beside conservation units (an ecological station and an environmental protection area) and one, ranked eighth, 2.4 km from the Tapeba indigenous land in Caucaia, the municipality of the contested project in [11]; the other two are flagged for high land-cover vulnerability. Fifteen of the 25 lie within 5 km of a boundary; under the corrected run described below, the review share rises to 12 of 25 and the within-5-km count to 20. The pattern is the finding: once ocean, water, and overlapping territory are removed, the cells the model likes best press against the boundaries the law protects, and the wind-farm record [6]–[9] shows what happens when that pressure is licensed without the communities at the table.</w:t>
+        <w:t xml:space="preserve">  The Ceará box is crowded with legal boundaries. Of its 2,808 cells, 1,353 lie offshore or outside the state, leaving 1,455 on land; 232 of those overlap conservation units, 124 overlap indigenous lands (Tapeba, declared, and Taba dos Anacé, in demarcation), and 552 lie within 2.5 km of one of those boundaries. Phase 3 hard-excludes 1,737 cells and 966 survive every constraint. The review flag then tracks the frontier upward: 310 of the 966 feasible cells carry it (32%), 90 of the 505 frontier cells, and 12 of the 25 recommended sites. Eight of the twelve lie within the 2.5 km buffer, seven beside conservation units (an ecological station and an environmental protection area) and one, ranked sixteenth, 2.4 km from the Tapeba indigenous land in Caucaia, the municipality of the contested project in [11]; the other four are flagged for high land-cover vulnerability. Twenty of the 25 lie within 5 km of a boundary, and fifteen sit directly on a transmission line. The pattern is the finding: once ocean, water, and overlapping territory are removed, the cells the model likes best press against the boundaries the law protects, and the wind-farm record [6]–[9] shows what happens when that pressure is licensed without the communities at the table.</w:t>
       </w:r>
     </w:p>
     <w:p>
@@ -2694,7 +2694,7 @@
           <w:sz w:val="21"/>
           <w:szCs w:val="21"/>
         </w:rPr>
-        <w:t xml:space="preserve">   Five limits are documented, not corrected, so the published numbers stay reproducible. First, a shortcut in Phase 4 treats a distance of exactly zero as missing, so a cell that a transmission line crosses is rejected as too far from one; correcting it admits   147 cells (966 feasible, 505 on the frontier) and promotes a cell scoring 74.33 above the current top of 73.52. Second, the curtailment objective is zero inside the box, so the frontier is effectively five-objective. Third, </w:t>
+        <w:t xml:space="preserve">   One defect was corrected and four limits are documented. The May 2026 run read a distance of exactly zero as missing, so a cell that a transmission line crosses was rejected as too far from one; the fix, applied on September 15, 2026, admitted 147 cells (819 to 966 feasible, 448 to 505 on the frontier) and replaced 15 of the 25 recommended sites, raising the top score from 73.52 to 74.33. The pre-fix outputs are archived in the repository. Of the remaining limits, first, the curtailment objective is zero inside the box, so the frontier is effectively five-objective. Second, </w:t>
       </w:r>
       <w:r>
         <w:rPr>
@@ -2718,7 +2718,7 @@
           <w:sz w:val="21"/>
           <w:szCs w:val="21"/>
         </w:rPr>
-        <w:t xml:space="preserve"> is capped at 0.90 for 355 cells, water is a yes/no test at cell centers, the land-cover raster is a partial download, and 50 of the 110 inventoried facilities sit at city or state centroids. Fourth, the classifier records no reason when the land-cover trigger alone sets a review flag, so two of the ten flagged sites read “no policy trigger.” Fifth, ANA water rights, quilombola territories, and the ANEEL plant registry are absent although the 0.05 L/kWh ceiling is ReData’s most quantitative condition.</w:t>
+        <w:t xml:space="preserve"> is capped at 0.90 for 355 cells, water is a yes/no test at cell centers, the land-cover raster is a partial download, and 50 of the 110 inventoried facilities sit at city or state centroids. Third, the classifier records no reason when the land-cover trigger alone sets a review flag, so four of the twelve flagged sites read “no policy trigger.” Fourth, ANA water rights, quilombola territories, and the ANEEL plant registry are absent although the 0.05 L/kWh ceiling is ReData’s most quantitative condition.</w:t>
       </w:r>
     </w:p>
     <w:p>
@@ -2754,7 +2754,7 @@
           <w:sz w:val="21"/>
           <w:szCs w:val="21"/>
         </w:rPr>
-        <w:t xml:space="preserve">ReData points gigawatt-scale load toward the Northeast; the wires there are already the constraint; and on the Ceará coast the cells that survive every filter sit against conservation units and a declared indigenous land in a municipality where a data center is already contested. The model makes that tension measurable before licensing begins. Next: ReData’s regional counterparts in the state weights, ANA water rights and quilombola territories as layers, the zero-distance correction applied, and the review-buffer finding reported under both runs.</w:t>
+        <w:t xml:space="preserve">ReData points gigawatt-scale load toward the Northeast; the wires there are already the constraint; and on the Ceará coast the cells that survive every filter sit against conservation units and a declared indigenous land in a municipality where a data center is already contested. The model makes that tension measurable before licensing begins. Next: ReData’s regional counterparts in the state weights, ANA water rights and quilombola territories as layers, and a sensitivity check of the review-buffer finding across the constraint thresholds.</w:t>
       </w:r>
     </w:p>
     <w:p>

</xml_diff>